<commit_message>
Maitê Proença: gancho mais forte na parte 1
Co-Authored-By: Claude Opus 5.5 <noreply@anthropic.com>
Claude-Session: https://claude.ai/code/session_01MJjUEEZrxQDEUifKK2vj9g
</commit_message>
<xml_diff>
--- a/roteiros/maite-proenca/MaiteProenca_Parte1_Introducao.docx
+++ b/roteiros/maite-proenca/MaiteProenca_Parte1_Introducao.docx
@@ -23,7 +23,7 @@
         <w:rPr>
           <w:color w:val="C00000"/>
         </w:rPr>
-        <w:t>O que pouca gente conectou é que o argumento que libertou aquele homem era tão repugnante que, décadas depois, a própria Justiça brasileira teve que proibi-lo.</w:t>
+        <w:t>O que pouca gente sabe é que aquele homem saiu do tribunal livre. Duas vezes. E que, anos depois, aquela família ainda ia enterrar mais dois homens.</w:t>
       </w:r>
     </w:p>
     <w:p>
@@ -31,7 +31,7 @@
         <w:rPr>
           <w:color w:val="C00000"/>
         </w:rPr>
-        <w:t>Fique até o final, porque você vai descobrir que argumento foi esse. E o preço brutal que aquela família pagou nos anos seguintes.</w:t>
+        <w:t>Fique até o final, porque você vai entender por que uma menina de doze anos defendeu o homem que matou a mãe dela. E a frase perturbadora que ela disse, mais de cinquenta anos depois, sobre o pai e a mãe.</w:t>
       </w:r>
     </w:p>
     <w:p>

</xml_diff>

<commit_message>
Maitê Proença: revisão da parte 1
Co-Authored-By: Claude Opus 5.5 <noreply@anthropic.com>
Claude-Session: https://claude.ai/code/session_01MJjUEEZrxQDEUifKK2vj9g
</commit_message>
<xml_diff>
--- a/roteiros/maite-proenca/MaiteProenca_Parte1_Introducao.docx
+++ b/roteiros/maite-proenca/MaiteProenca_Parte1_Introducao.docx
@@ -31,7 +31,7 @@
         <w:rPr>
           <w:color w:val="C00000"/>
         </w:rPr>
-        <w:t>Fique até o final, porque você vai entender por que uma menina de doze anos defendeu o homem que matou a mãe dela. E a frase perturbadora que ela disse, mais de cinquenta anos depois, sobre o pai e a mãe.</w:t>
+        <w:t>Fique até o final, porque você vai descobrir o que aconteceu com aquela menina depois do tribunal. E a frase perturbadora que ela mesma escreveu, anos depois, sobre o pai e a mãe.</w:t>
       </w:r>
     </w:p>
     <w:p>
@@ -63,7 +63,7 @@
         <w:rPr>
           <w:color w:val="000000"/>
         </w:rPr>
-        <w:t>O pai, Augusto Carlos Eduardo da Rocha Monteiro Gallo, era procurador de Justiça. Um homem da lei, respeitado, que atuava nos tribunais em nome da Justiça.</w:t>
+        <w:t>O pai, Augusto Carlos Eduardo da Rocha Monteiro Gallo, era procurador de Justiça. Um homem da lei, respeitado na cidade.</w:t>
       </w:r>
     </w:p>
     <w:p>
@@ -143,7 +143,7 @@
         <w:rPr>
           <w:color w:val="000000"/>
         </w:rPr>
-        <w:t>Margot tinha começado a ter aulas de francês. O professor se chamava Ives Gentilhomme.</w:t>
+        <w:t>Margot fazia aulas de francês. O professor se chamava Ives Gentilhomme.</w:t>
       </w:r>
     </w:p>
     <w:p>

</xml_diff>

<commit_message>
Maitê Proença: roteiro expandido para ~8 mil palavras com fatos verificados
Co-Authored-By: Claude Opus 5.5 <noreply@anthropic.com>
Claude-Session: https://claude.ai/code/session_01MJjUEEZrxQDEUifKK2vj9g
</commit_message>
<xml_diff>
--- a/roteiros/maite-proenca/MaiteProenca_Parte1_Introducao.docx
+++ b/roteiros/maite-proenca/MaiteProenca_Parte1_Introducao.docx
@@ -7,7 +7,7 @@
         <w:pStyle w:val="Heading1"/>
       </w:pPr>
       <w:r>
-        <w:t>MAITÊ PROENÇA — Parte 1: Gancho e introdução</w:t>
+        <w:t>MAITÊ PROENÇA — Parte 1: Introdução</w:t>
       </w:r>
     </w:p>
     <w:p>
@@ -79,6 +79,46 @@
         <w:rPr>
           <w:color w:val="000000"/>
         </w:rPr>
+        <w:t>Em casa, a arte estava por toda parte. Segundo uma reportagem da revista IstoÉ, a mãe tocava piano clássico cinco horas por dia.</w:t>
+      </w:r>
+    </w:p>
+    <w:p>
+      <w:r>
+        <w:rPr>
+          <w:color w:val="000000"/>
+        </w:rPr>
+        <w:t>Nas férias, a menina decorava diálogos de Shakespeare, no original, para representar ao lado do pai. Os preferidos dos dois vinham de Macbeth.</w:t>
+      </w:r>
+    </w:p>
+    <w:p>
+      <w:r>
+        <w:rPr>
+          <w:color w:val="000000"/>
+        </w:rPr>
+        <w:t>Macbeth. A tragédia de um homem que mata e acaba consumido pelo que fez.</w:t>
+      </w:r>
+    </w:p>
+    <w:p>
+      <w:r>
+        <w:rPr>
+          <w:color w:val="000000"/>
+        </w:rPr>
+        <w:t>Muitos anos depois, Maitê descreveria aquelas noites assim: "Minha mãe tocava piano de cauda e meu pai, quando chegava em casa à noite, contava histórias e fábulas da mitologia, havia mágica."</w:t>
+      </w:r>
+    </w:p>
+    <w:p>
+      <w:r>
+        <w:rPr>
+          <w:color w:val="000000"/>
+        </w:rPr>
+        <w:t>Pai e filha ensaiavam aquelas falas juntos, sem imaginar o que o futuro guardava para aquela casa.</w:t>
+      </w:r>
+    </w:p>
+    <w:p>
+      <w:r>
+        <w:rPr>
+          <w:color w:val="000000"/>
+        </w:rPr>
         <w:t>Maitê cresceu com dois irmãos. Um mais velho, Zuza, que tinha sido adotado pela família e era dez anos mais velho que ela. E um mais novo, René.</w:t>
       </w:r>
     </w:p>
@@ -96,6 +136,46 @@
           <w:color w:val="000000"/>
         </w:rPr>
         <w:t>Anos depois, a própria Maitê descreveria aquela infância com uma palavra que se repetia. Perfeita. Da casa à escola, tudo parecia perfeito.</w:t>
+      </w:r>
+    </w:p>
+    <w:p>
+      <w:r>
+        <w:rPr>
+          <w:color w:val="000000"/>
+        </w:rPr>
+        <w:t>Maitê era uma menina solta. Contou que adorava entrar no mar de ressaca, nas praias mais bravas, junto com três moleques. "Eu era de rua. Voltava para casa na hora que queria."</w:t>
+      </w:r>
+    </w:p>
+    <w:p>
+      <w:r>
+        <w:rPr>
+          <w:color w:val="000000"/>
+        </w:rPr>
+        <w:t>Nem aquela infância, porém, era tão protegida quanto parecia.</w:t>
+      </w:r>
+    </w:p>
+    <w:p>
+      <w:r>
+        <w:rPr>
+          <w:color w:val="000000"/>
+        </w:rPr>
+        <w:t>Aos dez anos, Maitê foi vítima de um abuso cometido por um motorista de ônibus. Conseguiu escapar dele.</w:t>
+      </w:r>
+    </w:p>
+    <w:p>
+      <w:r>
+        <w:rPr>
+          <w:color w:val="000000"/>
+        </w:rPr>
+        <w:t>Esse episódio ficou guardado por décadas. Só muito tempo depois ela falaria disso em público, num palco, diante de uma plateia.</w:t>
+      </w:r>
+    </w:p>
+    <w:p>
+      <w:r>
+        <w:rPr>
+          <w:color w:val="000000"/>
+        </w:rPr>
+        <w:t>Quando falou, fez questão de dizer que aquilo não tinha sido o que mais marcou a vida dela. O que marcou de verdade ainda estava por vir. Dentro da própria casa.</w:t>
       </w:r>
     </w:p>
     <w:p>
@@ -135,7 +215,7 @@
         <w:rPr>
           <w:color w:val="000000"/>
         </w:rPr>
-        <w:t>E, em mil novecentos e setenta, as desconfianças ganharam um nome.</w:t>
+        <w:t>Em mil novecentos e setenta, as desconfianças ganharam um nome.</w:t>
       </w:r>
     </w:p>
     <w:p>
@@ -215,7 +295,7 @@
         <w:rPr>
           <w:color w:val="000000"/>
         </w:rPr>
-        <w:t>Mas a ameaça ficou no ar daquela casa. E os filhos cresciam no meio de uma guerra silenciosa.</w:t>
+        <w:t>A ameaça ficou no ar daquela casa. E os filhos cresciam no meio de uma guerra silenciosa.</w:t>
       </w:r>
     </w:p>
     <w:p>
@@ -224,6 +304,14 @@
           <w:color w:val="000000"/>
         </w:rPr>
         <w:t>Um homem que representava a lei, que conhecia cada artigo do Código Penal, tinha acabado de apontar uma arma para a esposa. E, do lado de fora, a família continuava parecendo perfeita.</w:t>
+      </w:r>
+    </w:p>
+    <w:p>
+      <w:r>
+        <w:rPr>
+          <w:color w:val="000000"/>
+        </w:rPr>
+        <w:t>Quase cinquenta anos depois, num evento do Tribunal de Justiça do Rio de Janeiro sobre violência doméstica, Maitê diria uma frase que parece escrita para aquele revólver: "O primeiro gesto de violência pode ser o início do fim."</w:t>
       </w:r>
     </w:p>
     <w:p>

</xml_diff>

<commit_message>
Maitê Proença: auditoria de retenção e anti-IA no roteiro completo
Co-Authored-By: Claude Opus 5.5 <noreply@anthropic.com>
Claude-Session: https://claude.ai/code/session_01MJjUEEZrxQDEUifKK2vj9g
</commit_message>
<xml_diff>
--- a/roteiros/maite-proenca/MaiteProenca_Parte1_Introducao.docx
+++ b/roteiros/maite-proenca/MaiteProenca_Parte1_Introducao.docx
@@ -31,7 +31,7 @@
         <w:rPr>
           <w:color w:val="C00000"/>
         </w:rPr>
-        <w:t>Fique até o final, porque você vai descobrir o que aconteceu com aquela menina depois do tribunal. E a frase perturbadora que ela mesma escreveu, anos depois, sobre o pai e a mãe.</w:t>
+        <w:t>Fique até o final, porque você vai descobrir o que aconteceu com aquela menina depois do tribunal. E a frase perturbadora que ela mesma escreveu sobre o pai e a mãe.</w:t>
       </w:r>
     </w:p>
     <w:p>
@@ -79,7 +79,7 @@
         <w:rPr>
           <w:color w:val="000000"/>
         </w:rPr>
-        <w:t>Em casa, a arte estava por toda parte. Segundo uma reportagem da revista IstoÉ, a mãe tocava piano clássico cinco horas por dia.</w:t>
+        <w:t>Em casa, a arte estava por toda parte.</w:t>
       </w:r>
     </w:p>
     <w:p>
@@ -103,15 +103,15 @@
         <w:rPr>
           <w:color w:val="000000"/>
         </w:rPr>
-        <w:t>Muitos anos depois, Maitê descreveria aquelas noites assim: "Minha mãe tocava piano de cauda e meu pai, quando chegava em casa à noite, contava histórias e fábulas da mitologia, havia mágica."</w:t>
+        <w:t>Maitê descreveria aquelas noites assim: "Minha mãe tocava piano de cauda e meu pai, quando chegava em casa à noite, contava histórias e fábulas da mitologia, havia mágica."</w:t>
       </w:r>
     </w:p>
     <w:p>
       <w:r>
         <w:rPr>
-          <w:color w:val="000000"/>
+          <w:color w:val="C00000"/>
         </w:rPr>
-        <w:t>Pai e filha ensaiavam aquelas falas juntos, sem imaginar o que o futuro guardava para aquela casa.</w:t>
+        <w:t>Pai e filha ensaiavam aquelas falas juntos. Poucos anos depois, a tragédia ia sair das páginas de Shakespeare e entrar no quarto daquela casa.</w:t>
       </w:r>
     </w:p>
     <w:p>
@@ -135,7 +135,7 @@
         <w:rPr>
           <w:color w:val="000000"/>
         </w:rPr>
-        <w:t>Anos depois, a própria Maitê descreveria aquela infância com uma palavra que se repetia. Perfeita. Da casa à escola, tudo parecia perfeito.</w:t>
+        <w:t>A própria Maitê descreveria aquela infância com uma palavra que se repetia. Perfeita. Da casa à escola, tudo parecia perfeito.</w:t>
       </w:r>
     </w:p>
     <w:p>
@@ -175,7 +175,7 @@
         <w:rPr>
           <w:color w:val="000000"/>
         </w:rPr>
-        <w:t>Quando falou, fez questão de dizer que aquilo não tinha sido o que mais marcou a vida dela. O que marcou de verdade ainda estava por vir. Dentro da própria casa.</w:t>
+        <w:t>Quando falou, fez questão de dizer que a ferida mais funda da vida dela tinha outra origem. Uma origem dentro da própria casa.</w:t>
       </w:r>
     </w:p>
     <w:p>
@@ -239,7 +239,7 @@
         <w:rPr>
           <w:color w:val="000000"/>
         </w:rPr>
-        <w:t>Nunca houve prova disso. Nem naquele ano, nem nos processos que viriam depois. Mas, para um homem tomado pelo ciúme, a certeza não precisava de prova.</w:t>
+        <w:t>Prova disso nunca apareceu, em nenhum dos processos que vieram depois. Para um homem tomado pelo ciúme, bastava a desconfiança.</w:t>
       </w:r>
     </w:p>
     <w:p>

</xml_diff>